<commit_message>
docs: melhora introdução do problema-real.md e regenera .docx
- problema-real.md: integra cabeçalho ao texto, remove separador abrupto; mantém alinhamento com V2
- Regenera .docx com capa única (logo UFRB 1x) e estilos atualizados
- Proposta e Casos Existentes .docx permanecem consistentes
</commit_message>
<xml_diff>
--- a/disciplinas/gcetens843-projeto-algoritmo-i/atividades/trabalhos/projeto-algoritmos/problema-real.docx
+++ b/disciplinas/gcetens843-projeto-algoritmo-i/atividades/trabalhos/projeto-algoritmos/problema-real.docx
@@ -2,7 +2,7 @@
 <file path=word/document.xml><?xml version="1.0" encoding="utf-8"?>
 <w:document xmlns:w="http://schemas.openxmlformats.org/wordprocessingml/2006/main" xmlns:m="http://schemas.openxmlformats.org/officeDocument/2006/math" xmlns:r="http://schemas.openxmlformats.org/officeDocument/2006/relationships" xmlns:o="urn:schemas-microsoft-com:office:office" xmlns:v="urn:schemas-microsoft-com:vml" xmlns:w10="urn:schemas-microsoft-com:office:word" xmlns:a="http://schemas.openxmlformats.org/drawingml/2006/main" xmlns:pic="http://schemas.openxmlformats.org/drawingml/2006/picture" xmlns:wp="http://schemas.openxmlformats.org/drawingml/2006/wordprocessingDrawing">
   <w:body>
-    <w:bookmarkStart w:id="42" w:name="problema-real-minhafila"/>
+    <w:bookmarkStart w:id="41" w:name="problema-real-minhafila"/>
     <w:tbl>
       <w:tblPr>
         <w:tblW w:type="auto" w:w="0"/>
@@ -137,7 +137,7 @@
     </w:p>
     <w:p>
       <w:pPr>
-        <w:pStyle w:val="BlockText"/>
+        <w:pStyle w:val="FirstParagraph"/>
       </w:pPr>
       <w:r>
         <w:rPr>
@@ -160,13 +160,25 @@
           <w:b/>
           <w:bCs/>
         </w:rPr>
-        <w:t xml:space="preserve">Última atualização:</w:t>
-      </w:r>
-      <w:r>
-        <w:t xml:space="preserve"> </w:t>
-      </w:r>
-      <w:r>
-        <w:t xml:space="preserve">28/06/2026</w:t>
+        <w:t xml:space="preserve">Fonte-base:</w:t>
+      </w:r>
+      <w:r>
+        <w:t xml:space="preserve"> </w:t>
+      </w:r>
+      <w:r>
+        <w:t xml:space="preserve">Documento</w:t>
+      </w:r>
+      <w:r>
+        <w:t xml:space="preserve"> </w:t>
+      </w:r>
+      <w:r>
+        <w:t xml:space="preserve">“Projeto Algoritmo 1 V2”</w:t>
+      </w:r>
+      <w:r>
+        <w:t xml:space="preserve"> </w:t>
+      </w:r>
+      <w:r>
+        <w:t xml:space="preserve">(Rios, 2026)</w:t>
       </w:r>
       <w:r>
         <w:br/>
@@ -176,57 +188,21 @@
           <w:b/>
           <w:bCs/>
         </w:rPr>
-        <w:t xml:space="preserve">Fonte-base:</w:t>
-      </w:r>
-      <w:r>
-        <w:t xml:space="preserve"> </w:t>
-      </w:r>
-      <w:r>
-        <w:t xml:space="preserve">Documento</w:t>
-      </w:r>
-      <w:r>
-        <w:t xml:space="preserve"> </w:t>
-      </w:r>
-      <w:r>
-        <w:t xml:space="preserve">“Projeto Algoritmo 1 V2”</w:t>
-      </w:r>
-      <w:r>
-        <w:t xml:space="preserve"> </w:t>
-      </w:r>
-      <w:r>
-        <w:t xml:space="preserve">(Rios, 2026)</w:t>
-      </w:r>
-    </w:p>
-    <w:p>
-      <w:r>
-        <w:pict>
-          <v:rect style="width:0;height:1.5pt" o:hralign="center" o:hrstd="t" o:hr="t"/>
-        </w:pict>
-      </w:r>
-    </w:p>
-    <w:bookmarkStart w:id="20" w:name="contextualização"/>
-    <w:p>
-      <w:pPr>
-        <w:pStyle w:val="Heading2"/>
-      </w:pPr>
-      <w:r>
-        <w:t xml:space="preserve">1. Contextualização</w:t>
-      </w:r>
-    </w:p>
-    <w:p>
-      <w:pPr>
-        <w:pStyle w:val="FirstParagraph"/>
-      </w:pPr>
-      <w:r>
-        <w:t xml:space="preserve">A transformação digital tem promovido mudanças significativas em diversos setores da sociedade. Apesar dos avanços tecnológicos, a espera em filas de atendimento é uma experiência universal e cotidiana.</w:t>
-      </w:r>
-    </w:p>
-    <w:p>
-      <w:pPr>
-        <w:pStyle w:val="BodyText"/>
-      </w:pPr>
-      <w:r>
-        <w:t xml:space="preserve">O estudo matemático das filas foi formalizado por Agner Krarup Erlang no início do século XX, a partir da análise do tráfego telefônico na Copenhagen Telephone Exchange, dando origem à teoria das filas (</w:t>
+        <w:t xml:space="preserve">Última atualização:</w:t>
+      </w:r>
+      <w:r>
+        <w:t xml:space="preserve"> </w:t>
+      </w:r>
+      <w:r>
+        <w:t xml:space="preserve">28/06/2026</w:t>
+      </w:r>
+    </w:p>
+    <w:p>
+      <w:pPr>
+        <w:pStyle w:val="BodyText"/>
+      </w:pPr>
+      <w:r>
+        <w:t xml:space="preserve">A transformação digital tem promovido mudanças significativas em diversos setores da sociedade. Apesar dos avanços tecnológicos, a espera em filas de atendimento é uma experiência universal e cotidiana. O estudo matemático das filas foi formalizado por Agner Krarup Erlang no início do século XX, a partir da análise do tráfego telefônico na Copenhagen Telephone Exchange, dando origem à teoria das filas (</w:t>
       </w:r>
       <w:r>
         <w:rPr>
@@ -322,23 +298,40 @@
         </w:pict>
       </w:r>
     </w:p>
+    <w:bookmarkStart w:id="24" w:name="o-problema-em-diferentes-setores"/>
+    <w:p>
+      <w:pPr>
+        <w:pStyle w:val="Heading2"/>
+      </w:pPr>
+      <w:r>
+        <w:t xml:space="preserve">2. O problema em diferentes setores</w:t>
+      </w:r>
+    </w:p>
+    <w:bookmarkStart w:id="20" w:name="bancos-e-instituições-financeiras"/>
+    <w:p>
+      <w:pPr>
+        <w:pStyle w:val="Heading3"/>
+      </w:pPr>
+      <w:r>
+        <w:t xml:space="preserve">2.1 Bancos e instituições financeiras</w:t>
+      </w:r>
+    </w:p>
+    <w:p>
+      <w:pPr>
+        <w:pStyle w:val="FirstParagraph"/>
+      </w:pPr>
+      <w:r>
+        <w:t xml:space="preserve">O setor bancário é historicamente um dos mais afetados pelo problema das filas. Yusuf, Blessing e Kazeem (2015) demonstraram que a teoria de filas pode ser aplicada para avaliar o desempenho operacional em agências bancárias, influenciando diretamente a satisfação dos clientes. Mais recentemente, Daramola, Yahaya e Abdullahi (2024) reforçaram que modelos de fila multiservidor são fundamentais para reduzir o tempo de espera em instituições financeiras. O segmento BFSI (Banking, Financial Services and Insurance) representa aproximadamente 23,85% do mercado global de sistemas de gerenciamento de filas (Mordor Intelligence, 2026).</w:t>
+      </w:r>
+    </w:p>
     <w:bookmarkEnd w:id="20"/>
-    <w:bookmarkStart w:id="25" w:name="o-problema-em-diferentes-setores"/>
-    <w:p>
-      <w:pPr>
-        <w:pStyle w:val="Heading2"/>
-      </w:pPr>
-      <w:r>
-        <w:t xml:space="preserve">2. O problema em diferentes setores</w:t>
-      </w:r>
-    </w:p>
-    <w:bookmarkStart w:id="21" w:name="bancos-e-instituições-financeiras"/>
+    <w:bookmarkStart w:id="21" w:name="serviços-de-saúde"/>
     <w:p>
       <w:pPr>
         <w:pStyle w:val="Heading3"/>
       </w:pPr>
       <w:r>
-        <w:t xml:space="preserve">2.1 Bancos e instituições financeiras</w:t>
+        <w:t xml:space="preserve">2.2 Serviços de saúde</w:t>
       </w:r>
     </w:p>
     <w:p>
@@ -346,45 +339,27 @@
         <w:pStyle w:val="FirstParagraph"/>
       </w:pPr>
       <w:r>
-        <w:t xml:space="preserve">O setor bancário é historicamente um dos mais afetados pelo problema das filas. Yusuf, Blessing e Kazeem (2015) demonstraram que a teoria de filas pode ser aplicada para avaliar o desempenho operacional em agências bancárias, influenciando diretamente a satisfação dos clientes. Mais recentemente, Daramola, Yahaya e Abdullahi (2024) reforçaram que modelos de fila multiservidor são fundamentais para reduzir o tempo de espera em instituições financeiras. O segmento BFSI (Banking, Financial Services and Insurance) representa aproximadamente 23,85% do mercado global de sistemas de gerenciamento de filas (Mordor Intelligence, 2026).</w:t>
+        <w:t xml:space="preserve">Embora o foco deste projeto seja multipropósito, o setor de saúde merece destaque. Hospitais, clínicas, unidades básicas de saúde e laboratórios enfrentam desafios singulares na gestão de filas, agravados pela classificação de risco (triagem).</w:t>
+      </w:r>
+    </w:p>
+    <w:p>
+      <w:pPr>
+        <w:pStyle w:val="BodyText"/>
+      </w:pPr>
+      <w:r>
+        <w:t xml:space="preserve">Serviços que envolvem demanda espontânea, como UBSs e clínicas, são uma parcela importante dos atendimentos e, frequentemente, geram filas de pessoas aguardando uma senha para agendar uma consulta. Em todos os serviços de saúde de porta aberta, estratégias de gestão da demanda, no sentido de adequar a oferta para garantir o atendimento ao menor tempo possível, são um grande desafio (Giannotti; Louvison; Chioro, 2025).</w:t>
+      </w:r>
+    </w:p>
+    <w:p>
+      <w:pPr>
+        <w:pStyle w:val="BodyText"/>
+      </w:pPr>
+      <w:r>
+        <w:t xml:space="preserve">A espera prolongada está associada à aglomeração de pacientes, falhas na comunicação com os usuários, aumento do estresse, absenteísmo em consultas e redução da eficiência operacional dos serviços de saúde, constituindo importante barreira ao acesso oportuno à assistência (Thompson et al., 2023).</w:t>
       </w:r>
     </w:p>
     <w:bookmarkEnd w:id="21"/>
-    <w:bookmarkStart w:id="22" w:name="serviços-de-saúde"/>
-    <w:p>
-      <w:pPr>
-        <w:pStyle w:val="Heading3"/>
-      </w:pPr>
-      <w:r>
-        <w:t xml:space="preserve">2.2 Serviços de saúde</w:t>
-      </w:r>
-    </w:p>
-    <w:p>
-      <w:pPr>
-        <w:pStyle w:val="FirstParagraph"/>
-      </w:pPr>
-      <w:r>
-        <w:t xml:space="preserve">Embora o foco deste projeto seja multipropósito, o setor de saúde merece destaque. Hospitais, clínicas, unidades básicas de saúde e laboratórios enfrentam desafios singulares na gestão de filas, agravados pela classificação de risco (triagem).</w:t>
-      </w:r>
-    </w:p>
-    <w:p>
-      <w:pPr>
-        <w:pStyle w:val="BodyText"/>
-      </w:pPr>
-      <w:r>
-        <w:t xml:space="preserve">Serviços que envolvem demanda espontânea, como UBSs e clínicas, são uma parcela importante dos atendimentos e, frequentemente, geram filas de pessoas aguardando uma senha para agendar uma consulta. Em todos os serviços de saúde de porta aberta, estratégias de gestão da demanda, no sentido de adequar a oferta para garantir o atendimento ao menor tempo possível, são um grande desafio (Giannotti; Louvison; Chioro, 2025).</w:t>
-      </w:r>
-    </w:p>
-    <w:p>
-      <w:pPr>
-        <w:pStyle w:val="BodyText"/>
-      </w:pPr>
-      <w:r>
-        <w:t xml:space="preserve">A espera prolongada está associada à aglomeração de pacientes, falhas na comunicação com os usuários, aumento do estresse, absenteísmo em consultas e redução da eficiência operacional dos serviços de saúde, constituindo importante barreira ao acesso oportuno à assistência (Thompson et al., 2023).</w:t>
-      </w:r>
-    </w:p>
-    <w:bookmarkEnd w:id="22"/>
-    <w:bookmarkStart w:id="23" w:name="comércio-e-varejo"/>
+    <w:bookmarkStart w:id="22" w:name="comércio-e-varejo"/>
     <w:p>
       <w:pPr>
         <w:pStyle w:val="Heading3"/>
@@ -435,8 +410,8 @@
         <w:t xml:space="preserve">Os danos causados por uma má gestão de filas afetam também a fidelização. Dados recentes mostram que 68,5% dos funcionários do varejo lidam regularmente com clientes frustrados devido aos longos tempos de espera. Essa frustração se acumula e após várias experiências ruins, os clientes migram definitivamente para a concorrência (Queberry, 2026). O impacto econômico é expressivo: estima-se que para uma única loja, uma má gestão de filas pode custar mais de 4 milhões de dólares por ano. Para uma rede com 50 lojas, esse valor sobe para 206 milhões de dólares (Queberry, 2026).</w:t>
       </w:r>
     </w:p>
-    <w:bookmarkEnd w:id="23"/>
-    <w:bookmarkStart w:id="24" w:name="serviços-públicos"/>
+    <w:bookmarkEnd w:id="22"/>
+    <w:bookmarkStart w:id="23" w:name="serviços-públicos"/>
     <w:p>
       <w:pPr>
         <w:pStyle w:val="Heading3"/>
@@ -460,9 +435,9 @@
         </w:pict>
       </w:r>
     </w:p>
+    <w:bookmarkEnd w:id="23"/>
     <w:bookmarkEnd w:id="24"/>
-    <w:bookmarkEnd w:id="25"/>
-    <w:bookmarkStart w:id="41" w:name="referências"/>
+    <w:bookmarkStart w:id="40" w:name="referências"/>
     <w:p>
       <w:pPr>
         <w:pStyle w:val="Heading2"/>
@@ -494,7 +469,7 @@
       <w:r>
         <w:t xml:space="preserve"> </w:t>
       </w:r>
-      <w:hyperlink r:id="rId26">
+      <w:hyperlink r:id="rId25">
         <w:r>
           <w:rPr>
             <w:rStyle w:val="Hyperlink"/>
@@ -529,7 +504,7 @@
       <w:r>
         <w:t xml:space="preserve"> </w:t>
       </w:r>
-      <w:hyperlink r:id="rId27">
+      <w:hyperlink r:id="rId26">
         <w:r>
           <w:rPr>
             <w:rStyle w:val="Hyperlink"/>
@@ -564,7 +539,7 @@
       <w:r>
         <w:t xml:space="preserve"> </w:t>
       </w:r>
-      <w:hyperlink r:id="rId28">
+      <w:hyperlink r:id="rId27">
         <w:r>
           <w:rPr>
             <w:rStyle w:val="Hyperlink"/>
@@ -599,7 +574,7 @@
       <w:r>
         <w:t xml:space="preserve"> </w:t>
       </w:r>
-      <w:hyperlink r:id="rId29">
+      <w:hyperlink r:id="rId28">
         <w:r>
           <w:rPr>
             <w:rStyle w:val="Hyperlink"/>
@@ -652,7 +627,7 @@
       <w:r>
         <w:t xml:space="preserve"> </w:t>
       </w:r>
-      <w:hyperlink r:id="rId30">
+      <w:hyperlink r:id="rId29">
         <w:r>
           <w:rPr>
             <w:rStyle w:val="Hyperlink"/>
@@ -674,7 +649,7 @@
       <w:r>
         <w:t xml:space="preserve"> </w:t>
       </w:r>
-      <w:hyperlink r:id="rId31">
+      <w:hyperlink r:id="rId30">
         <w:r>
           <w:rPr>
             <w:rStyle w:val="Hyperlink"/>
@@ -709,7 +684,7 @@
       <w:r>
         <w:t xml:space="preserve"> </w:t>
       </w:r>
-      <w:hyperlink r:id="rId32">
+      <w:hyperlink r:id="rId31">
         <w:r>
           <w:rPr>
             <w:rStyle w:val="Hyperlink"/>
@@ -731,7 +706,7 @@
       <w:r>
         <w:t xml:space="preserve"> </w:t>
       </w:r>
-      <w:hyperlink r:id="rId33">
+      <w:hyperlink r:id="rId32">
         <w:r>
           <w:rPr>
             <w:rStyle w:val="Hyperlink"/>
@@ -766,7 +741,7 @@
       <w:r>
         <w:t xml:space="preserve"> </w:t>
       </w:r>
-      <w:hyperlink r:id="rId34">
+      <w:hyperlink r:id="rId33">
         <w:r>
           <w:rPr>
             <w:rStyle w:val="Hyperlink"/>
@@ -788,7 +763,7 @@
       <w:r>
         <w:t xml:space="preserve"> </w:t>
       </w:r>
-      <w:hyperlink r:id="rId35">
+      <w:hyperlink r:id="rId34">
         <w:r>
           <w:rPr>
             <w:rStyle w:val="Hyperlink"/>
@@ -810,7 +785,7 @@
       <w:r>
         <w:t xml:space="preserve"> </w:t>
       </w:r>
-      <w:hyperlink r:id="rId36">
+      <w:hyperlink r:id="rId35">
         <w:r>
           <w:rPr>
             <w:rStyle w:val="Hyperlink"/>
@@ -845,7 +820,7 @@
       <w:r>
         <w:t xml:space="preserve"> </w:t>
       </w:r>
-      <w:hyperlink r:id="rId37">
+      <w:hyperlink r:id="rId36">
         <w:r>
           <w:rPr>
             <w:rStyle w:val="Hyperlink"/>
@@ -867,7 +842,7 @@
       <w:r>
         <w:t xml:space="preserve"> </w:t>
       </w:r>
-      <w:hyperlink r:id="rId38">
+      <w:hyperlink r:id="rId37">
         <w:r>
           <w:rPr>
             <w:rStyle w:val="Hyperlink"/>
@@ -902,7 +877,7 @@
       <w:r>
         <w:t xml:space="preserve"> </w:t>
       </w:r>
-      <w:hyperlink r:id="rId39">
+      <w:hyperlink r:id="rId38">
         <w:r>
           <w:rPr>
             <w:rStyle w:val="Hyperlink"/>
@@ -937,7 +912,7 @@
       <w:r>
         <w:t xml:space="preserve"> </w:t>
       </w:r>
-      <w:hyperlink r:id="rId40">
+      <w:hyperlink r:id="rId39">
         <w:r>
           <w:rPr>
             <w:rStyle w:val="Hyperlink"/>
@@ -949,8 +924,8 @@
         <w:t xml:space="preserve">. Acesso em: 28 jun. 2026.</w:t>
       </w:r>
     </w:p>
+    <w:bookmarkEnd w:id="40"/>
     <w:bookmarkEnd w:id="41"/>
-    <w:bookmarkEnd w:id="42"/>
     <w:sectPr>
       <w:footerReference w:type="default" r:id="rId10"/>
       <w:footnotePr>

</xml_diff>

<commit_message>
chore: atualiza documentos para apresentacao final
</commit_message>
<xml_diff>
--- a/disciplinas/gcetens843-projeto-algoritmo-i/atividades/trabalhos/projeto-algoritmos/problema-real.docx
+++ b/disciplinas/gcetens843-projeto-algoritmo-i/atividades/trabalhos/projeto-algoritmos/problema-real.docx
@@ -2,7 +2,7 @@
 <file path=word/document.xml><?xml version="1.0" encoding="utf-8"?>
 <w:document xmlns:w="http://schemas.openxmlformats.org/wordprocessingml/2006/main" xmlns:m="http://schemas.openxmlformats.org/officeDocument/2006/math" xmlns:r="http://schemas.openxmlformats.org/officeDocument/2006/relationships" xmlns:o="urn:schemas-microsoft-com:office:office" xmlns:v="urn:schemas-microsoft-com:vml" xmlns:w10="urn:schemas-microsoft-com:office:word" xmlns:a="http://schemas.openxmlformats.org/drawingml/2006/main" xmlns:pic="http://schemas.openxmlformats.org/drawingml/2006/picture" xmlns:wp="http://schemas.openxmlformats.org/drawingml/2006/wordprocessingDrawing">
   <w:body>
-    <w:bookmarkStart w:id="41" w:name="problema-real-minhafila"/>
+    <w:bookmarkStart w:id="42" w:name="problema-real-minhafila"/>
     <w:tbl>
       <w:tblPr>
         <w:tblW w:type="auto" w:w="0"/>
@@ -197,9 +197,18 @@
         <w:t xml:space="preserve">28/06/2026</w:t>
       </w:r>
     </w:p>
-    <w:p>
-      <w:pPr>
-        <w:pStyle w:val="BodyText"/>
+    <w:bookmarkStart w:id="20" w:name="introdução"/>
+    <w:p>
+      <w:pPr>
+        <w:pStyle w:val="Heading2"/>
+      </w:pPr>
+      <w:r>
+        <w:t xml:space="preserve">1. Introdução</w:t>
+      </w:r>
+    </w:p>
+    <w:p>
+      <w:pPr>
+        <w:pStyle w:val="FirstParagraph"/>
       </w:pPr>
       <w:r>
         <w:t xml:space="preserve">A transformação digital tem promovido mudanças significativas em diversos setores da sociedade. Apesar dos avanços tecnológicos, a espera em filas de atendimento é uma experiência universal e cotidiana. O estudo matemático das filas foi formalizado por Agner Krarup Erlang no início do século XX, a partir da análise do tráfego telefônico na Copenhagen Telephone Exchange, dando origem à teoria das filas (</w:t>
@@ -298,7 +307,8 @@
         </w:pict>
       </w:r>
     </w:p>
-    <w:bookmarkStart w:id="24" w:name="o-problema-em-diferentes-setores"/>
+    <w:bookmarkEnd w:id="20"/>
+    <w:bookmarkStart w:id="25" w:name="o-problema-em-diferentes-setores"/>
     <w:p>
       <w:pPr>
         <w:pStyle w:val="Heading2"/>
@@ -307,7 +317,7 @@
         <w:t xml:space="preserve">2. O problema em diferentes setores</w:t>
       </w:r>
     </w:p>
-    <w:bookmarkStart w:id="20" w:name="bancos-e-instituições-financeiras"/>
+    <w:bookmarkStart w:id="21" w:name="bancos-e-instituições-financeiras"/>
     <w:p>
       <w:pPr>
         <w:pStyle w:val="Heading3"/>
@@ -324,8 +334,8 @@
         <w:t xml:space="preserve">O setor bancário é historicamente um dos mais afetados pelo problema das filas. Yusuf, Blessing e Kazeem (2015) demonstraram que a teoria de filas pode ser aplicada para avaliar o desempenho operacional em agências bancárias, influenciando diretamente a satisfação dos clientes. Mais recentemente, Daramola, Yahaya e Abdullahi (2024) reforçaram que modelos de fila multiservidor são fundamentais para reduzir o tempo de espera em instituições financeiras. O segmento BFSI (Banking, Financial Services and Insurance) representa aproximadamente 23,85% do mercado global de sistemas de gerenciamento de filas (Mordor Intelligence, 2026).</w:t>
       </w:r>
     </w:p>
-    <w:bookmarkEnd w:id="20"/>
-    <w:bookmarkStart w:id="21" w:name="serviços-de-saúde"/>
+    <w:bookmarkEnd w:id="21"/>
+    <w:bookmarkStart w:id="22" w:name="serviços-de-saúde"/>
     <w:p>
       <w:pPr>
         <w:pStyle w:val="Heading3"/>
@@ -358,8 +368,8 @@
         <w:t xml:space="preserve">A espera prolongada está associada à aglomeração de pacientes, falhas na comunicação com os usuários, aumento do estresse, absenteísmo em consultas e redução da eficiência operacional dos serviços de saúde, constituindo importante barreira ao acesso oportuno à assistência (Thompson et al., 2023).</w:t>
       </w:r>
     </w:p>
-    <w:bookmarkEnd w:id="21"/>
-    <w:bookmarkStart w:id="22" w:name="comércio-e-varejo"/>
+    <w:bookmarkEnd w:id="22"/>
+    <w:bookmarkStart w:id="23" w:name="comércio-e-varejo"/>
     <w:p>
       <w:pPr>
         <w:pStyle w:val="Heading3"/>
@@ -410,8 +420,8 @@
         <w:t xml:space="preserve">Os danos causados por uma má gestão de filas afetam também a fidelização. Dados recentes mostram que 68,5% dos funcionários do varejo lidam regularmente com clientes frustrados devido aos longos tempos de espera. Essa frustração se acumula e após várias experiências ruins, os clientes migram definitivamente para a concorrência (Queberry, 2026). O impacto econômico é expressivo: estima-se que para uma única loja, uma má gestão de filas pode custar mais de 4 milhões de dólares por ano. Para uma rede com 50 lojas, esse valor sobe para 206 milhões de dólares (Queberry, 2026).</w:t>
       </w:r>
     </w:p>
-    <w:bookmarkEnd w:id="22"/>
-    <w:bookmarkStart w:id="23" w:name="serviços-públicos"/>
+    <w:bookmarkEnd w:id="23"/>
+    <w:bookmarkStart w:id="24" w:name="serviços-públicos"/>
     <w:p>
       <w:pPr>
         <w:pStyle w:val="Heading3"/>
@@ -435,9 +445,9 @@
         </w:pict>
       </w:r>
     </w:p>
-    <w:bookmarkEnd w:id="23"/>
     <w:bookmarkEnd w:id="24"/>
-    <w:bookmarkStart w:id="40" w:name="referências"/>
+    <w:bookmarkEnd w:id="25"/>
+    <w:bookmarkStart w:id="41" w:name="referências"/>
     <w:p>
       <w:pPr>
         <w:pStyle w:val="Heading2"/>
@@ -469,7 +479,7 @@
       <w:r>
         <w:t xml:space="preserve"> </w:t>
       </w:r>
-      <w:hyperlink r:id="rId25">
+      <w:hyperlink r:id="rId26">
         <w:r>
           <w:rPr>
             <w:rStyle w:val="Hyperlink"/>
@@ -504,7 +514,7 @@
       <w:r>
         <w:t xml:space="preserve"> </w:t>
       </w:r>
-      <w:hyperlink r:id="rId26">
+      <w:hyperlink r:id="rId27">
         <w:r>
           <w:rPr>
             <w:rStyle w:val="Hyperlink"/>
@@ -539,7 +549,7 @@
       <w:r>
         <w:t xml:space="preserve"> </w:t>
       </w:r>
-      <w:hyperlink r:id="rId27">
+      <w:hyperlink r:id="rId28">
         <w:r>
           <w:rPr>
             <w:rStyle w:val="Hyperlink"/>
@@ -574,7 +584,7 @@
       <w:r>
         <w:t xml:space="preserve"> </w:t>
       </w:r>
-      <w:hyperlink r:id="rId28">
+      <w:hyperlink r:id="rId29">
         <w:r>
           <w:rPr>
             <w:rStyle w:val="Hyperlink"/>
@@ -627,7 +637,7 @@
       <w:r>
         <w:t xml:space="preserve"> </w:t>
       </w:r>
-      <w:hyperlink r:id="rId29">
+      <w:hyperlink r:id="rId30">
         <w:r>
           <w:rPr>
             <w:rStyle w:val="Hyperlink"/>
@@ -649,7 +659,7 @@
       <w:r>
         <w:t xml:space="preserve"> </w:t>
       </w:r>
-      <w:hyperlink r:id="rId30">
+      <w:hyperlink r:id="rId31">
         <w:r>
           <w:rPr>
             <w:rStyle w:val="Hyperlink"/>
@@ -684,7 +694,7 @@
       <w:r>
         <w:t xml:space="preserve"> </w:t>
       </w:r>
-      <w:hyperlink r:id="rId31">
+      <w:hyperlink r:id="rId32">
         <w:r>
           <w:rPr>
             <w:rStyle w:val="Hyperlink"/>
@@ -706,7 +716,7 @@
       <w:r>
         <w:t xml:space="preserve"> </w:t>
       </w:r>
-      <w:hyperlink r:id="rId32">
+      <w:hyperlink r:id="rId33">
         <w:r>
           <w:rPr>
             <w:rStyle w:val="Hyperlink"/>
@@ -741,7 +751,7 @@
       <w:r>
         <w:t xml:space="preserve"> </w:t>
       </w:r>
-      <w:hyperlink r:id="rId33">
+      <w:hyperlink r:id="rId34">
         <w:r>
           <w:rPr>
             <w:rStyle w:val="Hyperlink"/>
@@ -763,7 +773,7 @@
       <w:r>
         <w:t xml:space="preserve"> </w:t>
       </w:r>
-      <w:hyperlink r:id="rId34">
+      <w:hyperlink r:id="rId35">
         <w:r>
           <w:rPr>
             <w:rStyle w:val="Hyperlink"/>
@@ -785,7 +795,7 @@
       <w:r>
         <w:t xml:space="preserve"> </w:t>
       </w:r>
-      <w:hyperlink r:id="rId35">
+      <w:hyperlink r:id="rId36">
         <w:r>
           <w:rPr>
             <w:rStyle w:val="Hyperlink"/>
@@ -820,7 +830,7 @@
       <w:r>
         <w:t xml:space="preserve"> </w:t>
       </w:r>
-      <w:hyperlink r:id="rId36">
+      <w:hyperlink r:id="rId37">
         <w:r>
           <w:rPr>
             <w:rStyle w:val="Hyperlink"/>
@@ -842,7 +852,7 @@
       <w:r>
         <w:t xml:space="preserve"> </w:t>
       </w:r>
-      <w:hyperlink r:id="rId37">
+      <w:hyperlink r:id="rId38">
         <w:r>
           <w:rPr>
             <w:rStyle w:val="Hyperlink"/>
@@ -877,7 +887,7 @@
       <w:r>
         <w:t xml:space="preserve"> </w:t>
       </w:r>
-      <w:hyperlink r:id="rId38">
+      <w:hyperlink r:id="rId39">
         <w:r>
           <w:rPr>
             <w:rStyle w:val="Hyperlink"/>
@@ -912,7 +922,7 @@
       <w:r>
         <w:t xml:space="preserve"> </w:t>
       </w:r>
-      <w:hyperlink r:id="rId39">
+      <w:hyperlink r:id="rId40">
         <w:r>
           <w:rPr>
             <w:rStyle w:val="Hyperlink"/>
@@ -924,13 +934,10 @@
         <w:t xml:space="preserve">. Acesso em: 28 jun. 2026.</w:t>
       </w:r>
     </w:p>
-    <w:bookmarkEnd w:id="40"/>
     <w:bookmarkEnd w:id="41"/>
+    <w:bookmarkEnd w:id="42"/>
     <w:sectPr>
       <w:footerReference w:type="default" r:id="rId10"/>
-      <w:footnotePr>
-        <w:numRestart w:val="eachSect"/>
-      </w:footnotePr>
     </w:sectPr>
   </w:body>
 </w:document>

</xml_diff>